<commit_message>
Tie-in register: structured tie-in conditions, tie_in_register engine, agreement rounds
- tie_in schema: category, scope break, connection, isolation, protection, operating
  envelope (barg/degC), capacity, electrical data, HMB stream/metric, upstream chain,
  dates, agreement (status, agreed_by, agreed_ref)
- tie_in_register engine (xlsx + docx + pdf) with checks: completeness, HMB envelope
  over all 9 cases, Owner-EPC-IEC chain, dates, agreement, scope coverage; tests
- TQ-IEC-021: ST valve casing design, new IF-45/IF-46 (spray water), IF-03 location,
  IPB tap-off rating; IEC-ALP-IF-001 Rev A registered; all IF points agreed
- TQ-030..032 and TQ-027 answered by the Owner: TP-A2, TP-T2, TP-T3 added, missing data
  supplied, export limiter 640 MW; all TP points agreed
- lesson L-EPCE-0001

Co-Authored-By: Claude Opus 5.5 <noreply@anthropic.com>
Claude-Session: https://claude.ai/code/session_01TuQPCZMPzEzscTVqEEHFMo
</commit_message>
<xml_diff>
--- a/output/contract_document/ALP-EPC-001_contract.docx
+++ b/output/contract_document/ALP-EPC-001_contract.docx
@@ -17281,7 +17281,7 @@
               <w:rPr>
                 <w:sz w:val="16"/>
               </w:rPr>
-              <w:t>2027-03-01</w:t>
+              <w:t>2027-02-01</w:t>
             </w:r>
           </w:p>
         </w:tc>
@@ -17296,7 +17296,7 @@
               <w:rPr>
                 <w:sz w:val="16"/>
               </w:rPr>
-              <w:t>TP-CW1</w:t>
+              <w:t>TP-A2</w:t>
             </w:r>
           </w:p>
         </w:tc>
@@ -17309,7 +17309,7 @@
               <w:rPr>
                 <w:sz w:val="16"/>
               </w:rPr>
-              <w:t>Seawater intake head</w:t>
+              <w:t>Site (plot) handover</w:t>
             </w:r>
           </w:p>
         </w:tc>
@@ -17322,7 +17322,7 @@
               <w:rPr>
                 <w:sz w:val="16"/>
               </w:rPr>
-              <w:t>About 650 m offshore at -12 m</w:t>
+              <w:t>Plot E 0-400, N 0-300 (plant grid), levelled to +15.0 m</w:t>
             </w:r>
           </w:p>
         </w:tc>
@@ -17335,7 +17335,6 @@
               <w:rPr>
                 <w:sz w:val="16"/>
               </w:rPr>
-              <w:t>about 2 x DN2200 (Contractor to size)</w:t>
             </w:r>
           </w:p>
         </w:tc>
@@ -17348,7 +17347,7 @@
               <w:rPr>
                 <w:sz w:val="16"/>
               </w:rPr>
-              <w:t>6.9-27.0 degC</w:t>
+              <w:t>East strip E 370-400 available 2027-06-30 (needed by the Contractor 2027-09-01 for the gas station civil works).</w:t>
             </w:r>
           </w:p>
         </w:tc>
@@ -17361,7 +17360,7 @@
               <w:rPr>
                 <w:sz w:val="16"/>
               </w:rPr>
-              <w:t>Seabed survey and marine permit</w:t>
+              <w:t>Plot free of encumbrances, levelled to +15.0 m, boundary monuments; relocation of the buried 11 kV cable (E 390) by 2027-06-30</w:t>
             </w:r>
           </w:p>
         </w:tc>
@@ -17374,7 +17373,7 @@
               <w:rPr>
                 <w:sz w:val="16"/>
               </w:rPr>
-              <w:t>Intake head, pipelines, pump house</w:t>
+              <w:t>All works within the plot from the access date</w:t>
             </w:r>
           </w:p>
         </w:tc>
@@ -17387,7 +17386,7 @@
               <w:rPr>
                 <w:sz w:val="16"/>
               </w:rPr>
-              <w:t>2027-04-30</w:t>
+              <w:t>2026-11-02</w:t>
             </w:r>
           </w:p>
         </w:tc>
@@ -17402,7 +17401,7 @@
               <w:rPr>
                 <w:sz w:val="16"/>
               </w:rPr>
-              <w:t>TP-CW2</w:t>
+              <w:t>TP-CW1</w:t>
             </w:r>
           </w:p>
         </w:tc>
@@ -17415,7 +17414,7 @@
               <w:rPr>
                 <w:sz w:val="16"/>
               </w:rPr>
-              <w:t>Outfall diffuser</w:t>
+              <w:t>Seawater intake head</w:t>
             </w:r>
           </w:p>
         </w:tc>
@@ -17428,7 +17427,7 @@
               <w:rPr>
                 <w:sz w:val="16"/>
               </w:rPr>
-              <w:t>About 350 m offshore, at least 250 m from the intake</w:t>
+              <w:t>About 650 m offshore at -12 m</w:t>
             </w:r>
           </w:p>
         </w:tc>
@@ -17441,6 +17440,7 @@
               <w:rPr>
                 <w:sz w:val="16"/>
               </w:rPr>
+              <w:t>about 2 x DN2200 (Contractor to size)</w:t>
             </w:r>
           </w:p>
         </w:tc>
@@ -17453,6 +17453,7 @@
               <w:rPr>
                 <w:sz w:val="16"/>
               </w:rPr>
+              <w:t>6.9-27.0 degC</w:t>
             </w:r>
           </w:p>
         </w:tc>
@@ -17465,7 +17466,7 @@
               <w:rPr>
                 <w:sz w:val="16"/>
               </w:rPr>
-              <w:t>Marine permit</w:t>
+              <w:t>Seabed survey and marine permit</w:t>
             </w:r>
           </w:p>
         </w:tc>
@@ -17478,7 +17479,7 @@
               <w:rPr>
                 <w:sz w:val="16"/>
               </w:rPr>
-              <w:t>Outfall pipeline and diffuser</w:t>
+              <w:t>Intake head, pipelines, pump house</w:t>
             </w:r>
           </w:p>
         </w:tc>
@@ -17506,7 +17507,7 @@
               <w:rPr>
                 <w:sz w:val="16"/>
               </w:rPr>
-              <w:t>TP-D1</w:t>
+              <w:t>TP-CW2</w:t>
             </w:r>
           </w:p>
         </w:tc>
@@ -17519,7 +17520,7 @@
               <w:rPr>
                 <w:sz w:val="16"/>
               </w:rPr>
-              <w:t>Storm water discharge</w:t>
+              <w:t>Outfall diffuser</w:t>
             </w:r>
           </w:p>
         </w:tc>
@@ -17532,7 +17533,7 @@
               <w:rPr>
                 <w:sz w:val="16"/>
               </w:rPr>
-              <w:t>Western stream channel (max 2 m3/s) or to sea</w:t>
+              <w:t>About 350 m offshore, at least 250 m from the intake</w:t>
             </w:r>
           </w:p>
         </w:tc>
@@ -17569,7 +17570,7 @@
               <w:rPr>
                 <w:sz w:val="16"/>
               </w:rPr>
-              <w:t>Water authority consent</w:t>
+              <w:t>Marine permit</w:t>
             </w:r>
           </w:p>
         </w:tc>
@@ -17582,7 +17583,7 @@
               <w:rPr>
                 <w:sz w:val="16"/>
               </w:rPr>
-              <w:t>Site drainage, oil interceptors, outlet structure</w:t>
+              <w:t>Outfall pipeline and diffuser</w:t>
             </w:r>
           </w:p>
         </w:tc>
@@ -17595,7 +17596,7 @@
               <w:rPr>
                 <w:sz w:val="16"/>
               </w:rPr>
-              <w:t>2026-11-02</w:t>
+              <w:t>2027-04-30</w:t>
             </w:r>
           </w:p>
         </w:tc>
@@ -17610,7 +17611,7 @@
               <w:rPr>
                 <w:sz w:val="16"/>
               </w:rPr>
-              <w:t>TP-E1</w:t>
+              <w:t>TP-D1</w:t>
             </w:r>
           </w:p>
         </w:tc>
@@ -17623,7 +17624,7 @@
               <w:rPr>
                 <w:sz w:val="16"/>
               </w:rPr>
-              <w:t>Grid connection 380 kV</w:t>
+              <w:t>Storm water discharge</w:t>
             </w:r>
           </w:p>
         </w:tc>
@@ -17636,7 +17637,7 @@
               <w:rPr>
                 <w:sz w:val="16"/>
               </w:rPr>
-              <w:t>Line gantry at the north-west corner</w:t>
+              <w:t>Western stream channel (max 2 m3/s) or to sea</w:t>
             </w:r>
           </w:p>
         </w:tc>
@@ -17649,7 +17650,6 @@
               <w:rPr>
                 <w:sz w:val="16"/>
               </w:rPr>
-              <w:t>380 kV, 2 circuits</w:t>
             </w:r>
           </w:p>
         </w:tc>
@@ -17662,7 +17662,6 @@
               <w:rPr>
                 <w:sz w:val="16"/>
               </w:rPr>
-              <w:t>360-410 kV; SCL 12-40 kA</w:t>
             </w:r>
           </w:p>
         </w:tc>
@@ -17675,7 +17674,7 @@
               <w:rPr>
                 <w:sz w:val="16"/>
               </w:rPr>
-              <w:t>Double-circuit 380 kV OHL up to the dead-end tower, conductors to the gantry</w:t>
+              <w:t>Water authority consent</w:t>
             </w:r>
           </w:p>
         </w:tc>
@@ -17688,7 +17687,7 @@
               <w:rPr>
                 <w:sz w:val="16"/>
               </w:rPr>
-              <w:t>Gantry, GIS switchyard, protection and metering</w:t>
+              <w:t>Site drainage, oil interceptors, outlet structure</w:t>
             </w:r>
           </w:p>
         </w:tc>
@@ -17701,7 +17700,7 @@
               <w:rPr>
                 <w:sz w:val="16"/>
               </w:rPr>
-              <w:t>2028-07-15</w:t>
+              <w:t>2026-11-02</w:t>
             </w:r>
           </w:p>
         </w:tc>
@@ -17716,7 +17715,7 @@
               <w:rPr>
                 <w:sz w:val="16"/>
               </w:rPr>
-              <w:t>TP-E2</w:t>
+              <w:t>TP-E1</w:t>
             </w:r>
           </w:p>
         </w:tc>
@@ -17729,7 +17728,7 @@
               <w:rPr>
                 <w:sz w:val="16"/>
               </w:rPr>
-              <w:t>Construction power</w:t>
+              <w:t>Grid connection 380 kV</w:t>
             </w:r>
           </w:p>
         </w:tc>
@@ -17742,7 +17741,7 @@
               <w:rPr>
                 <w:sz w:val="16"/>
               </w:rPr>
-              <w:t>North gate</w:t>
+              <w:t>Line gantry at the north-west corner</w:t>
             </w:r>
           </w:p>
         </w:tc>
@@ -17755,7 +17754,7 @@
               <w:rPr>
                 <w:sz w:val="16"/>
               </w:rPr>
-              <w:t>34.5 kV / 5 MVA</w:t>
+              <w:t>380 kV, 2 circuits</w:t>
             </w:r>
           </w:p>
         </w:tc>
@@ -17768,6 +17767,7 @@
               <w:rPr>
                 <w:sz w:val="16"/>
               </w:rPr>
+              <w:t>380 kV nominal, 420 kV highest; 360-410 kV normal, 342-420 kV up to 30 min; 49.0-51.0 Hz; short-circuit 12-40 kA (2029), 50 kA (2035 planning); connection capacity 640 MW export / 40 MW import (ALP-OWN-ELE-001).</w:t>
             </w:r>
           </w:p>
         </w:tc>
@@ -17780,7 +17780,7 @@
               <w:rPr>
                 <w:sz w:val="16"/>
               </w:rPr>
-              <w:t>34.5 kV connection, 5 MVA, metering</w:t>
+              <w:t>Double-circuit 380 kV OHL up to the dead-end tower, conductors to the gantry</w:t>
             </w:r>
           </w:p>
         </w:tc>
@@ -17793,7 +17793,7 @@
               <w:rPr>
                 <w:sz w:val="16"/>
               </w:rPr>
-              <w:t>Construction substations and distribution</w:t>
+              <w:t>Gantry, GIS switchyard, protection and metering</w:t>
             </w:r>
           </w:p>
         </w:tc>
@@ -17806,7 +17806,7 @@
               <w:rPr>
                 <w:sz w:val="16"/>
               </w:rPr>
-              <w:t>2027-02-28</w:t>
+              <w:t>2028-07-15</w:t>
             </w:r>
           </w:p>
         </w:tc>
@@ -17821,7 +17821,7 @@
               <w:rPr>
                 <w:sz w:val="16"/>
               </w:rPr>
-              <w:t>TP-G1</w:t>
+              <w:t>TP-E2</w:t>
             </w:r>
           </w:p>
         </w:tc>
@@ -17834,7 +17834,7 @@
               <w:rPr>
                 <w:sz w:val="16"/>
               </w:rPr>
-              <w:t>Natural gas supply</w:t>
+              <w:t>Construction power</w:t>
             </w:r>
           </w:p>
         </w:tc>
@@ -17847,7 +17847,7 @@
               <w:rPr>
                 <w:sz w:val="16"/>
               </w:rPr>
-              <w:t>North-east plot corner, flange at EL +14.0</w:t>
+              <w:t>North gate</w:t>
             </w:r>
           </w:p>
         </w:tc>
@@ -17860,7 +17860,7 @@
               <w:rPr>
                 <w:sz w:val="16"/>
               </w:rPr>
-              <w:t>16 in (DN400), CL600</w:t>
+              <w:t>34.5 kV / 5 MVA</w:t>
             </w:r>
           </w:p>
         </w:tc>
@@ -17873,7 +17873,7 @@
               <w:rPr>
                 <w:sz w:val="16"/>
               </w:rPr>
-              <w:t>45-70 barg normal/minimum, 40 barg exceptional (72 h/year); 5-25 degC; 115,000 Sm3/h firm</w:t>
+              <w:t>34.5 kV +/- 10 %, 5 MVA, prospective short-circuit 12.5 kA (distribution company).</w:t>
             </w:r>
           </w:p>
         </w:tc>
@@ -17886,7 +17886,7 @@
               <w:rPr>
                 <w:sz w:val="16"/>
               </w:rPr>
-              <w:t>16-inch spur line (4.5 km), tap valve station, isolation valve and insulating joint</w:t>
+              <w:t>34.5 kV connection, 5 MVA, metering</w:t>
             </w:r>
           </w:p>
         </w:tc>
@@ -17899,7 +17899,7 @@
               <w:rPr>
                 <w:sz w:val="16"/>
               </w:rPr>
-              <w:t>Gas receiving and metering station from the inlet flange</w:t>
+              <w:t>Construction substations and distribution</w:t>
             </w:r>
           </w:p>
         </w:tc>
@@ -17912,7 +17912,7 @@
               <w:rPr>
                 <w:sz w:val="16"/>
               </w:rPr>
-              <w:t>2028-06-30</w:t>
+              <w:t>2027-02-28</w:t>
             </w:r>
           </w:p>
         </w:tc>
@@ -17927,7 +17927,7 @@
               <w:rPr>
                 <w:sz w:val="16"/>
               </w:rPr>
-              <w:t>TP-L1</w:t>
+              <w:t>TP-G1</w:t>
             </w:r>
           </w:p>
         </w:tc>
@@ -17940,7 +17940,7 @@
               <w:rPr>
                 <w:sz w:val="16"/>
               </w:rPr>
-              <w:t>LDO supply</w:t>
+              <w:t>Natural gas supply</w:t>
             </w:r>
           </w:p>
         </w:tc>
@@ -17953,7 +17953,7 @@
               <w:rPr>
                 <w:sz w:val="16"/>
               </w:rPr>
-              <w:t>North gate (road tankers)</w:t>
+              <w:t>North-east plot corner, flange at EL +14.0</w:t>
             </w:r>
           </w:p>
         </w:tc>
@@ -17966,6 +17966,7 @@
               <w:rPr>
                 <w:sz w:val="16"/>
               </w:rPr>
+              <w:t>16 in (DN400), CL600</w:t>
             </w:r>
           </w:p>
         </w:tc>
@@ -17978,6 +17979,7 @@
               <w:rPr>
                 <w:sz w:val="16"/>
               </w:rPr>
+              <w:t>Normal 55-65 barg; minimum 45 barg for full load; exceptional 40 barg up to 72 h/year (GT load limited, ER-03.03); MOP 70 / MAOP 75 barg; 5-25 degC; 115,000 Sm3/h firm (density 0.7325 kg/Sm3 at 15 degC, reference gas).</w:t>
             </w:r>
           </w:p>
         </w:tc>
@@ -17990,7 +17992,7 @@
               <w:rPr>
                 <w:sz w:val="16"/>
               </w:rPr>
-              <w:t>LDO supply contract (up to 25 trucks/day), first fill</w:t>
+              <w:t>16-inch spur line (4.5 km), tap valve station, isolation valve and insulating joint</w:t>
             </w:r>
           </w:p>
         </w:tc>
@@ -18003,7 +18005,7 @@
               <w:rPr>
                 <w:sz w:val="16"/>
               </w:rPr>
-              <w:t>Unloading station and storage</w:t>
+              <w:t>Gas receiving and metering station from the inlet flange</w:t>
             </w:r>
           </w:p>
         </w:tc>
@@ -18016,7 +18018,7 @@
               <w:rPr>
                 <w:sz w:val="16"/>
               </w:rPr>
-              <w:t>2028-09-01</w:t>
+              <w:t>2028-06-30</w:t>
             </w:r>
           </w:p>
         </w:tc>
@@ -18031,7 +18033,7 @@
               <w:rPr>
                 <w:sz w:val="16"/>
               </w:rPr>
-              <w:t>TP-M1</w:t>
+              <w:t>TP-L1</w:t>
             </w:r>
           </w:p>
         </w:tc>
@@ -18044,7 +18046,7 @@
               <w:rPr>
                 <w:sz w:val="16"/>
               </w:rPr>
-              <w:t>Temporary barge landing</w:t>
+              <w:t>LDO supply</w:t>
             </w:r>
           </w:p>
         </w:tc>
@@ -18057,7 +18059,7 @@
               <w:rPr>
                 <w:sz w:val="16"/>
               </w:rPr>
-              <w:t>Public coastal strip south of the plot</w:t>
+              <w:t>North gate (road tankers)</w:t>
             </w:r>
           </w:p>
         </w:tc>
@@ -18070,6 +18072,7 @@
               <w:rPr>
                 <w:sz w:val="16"/>
               </w:rPr>
+              <w:t>4 in tanker coupling (API RP 1004 bottom loading / dry-break)</w:t>
             </w:r>
           </w:p>
         </w:tc>
@@ -18082,6 +18085,7 @@
               <w:rPr>
                 <w:sz w:val="16"/>
               </w:rPr>
+              <w:t>Up to 25 trucks/day (about 30 m3 each); 4 bays at about 100 m3/h each unloading pump set; LDO per TS EN 590 based specification.</w:t>
             </w:r>
           </w:p>
         </w:tc>
@@ -18094,7 +18098,7 @@
               <w:rPr>
                 <w:sz w:val="16"/>
               </w:rPr>
-              <w:t>Coastal permit: application by 2027-04-30 if the Contractor's permit design is received by 2027-03-31; permit targeted by 2027-09-30</w:t>
+              <w:t>LDO supply contract (up to 25 trucks/day), first fill</w:t>
             </w:r>
           </w:p>
         </w:tc>
@@ -18107,7 +18111,7 @@
               <w:rPr>
                 <w:sz w:val="16"/>
               </w:rPr>
-              <w:t>Design, construction, operation and removal of the landing; marine works only 1 October - 30 April</w:t>
+              <w:t>Unloading station and storage</w:t>
             </w:r>
           </w:p>
         </w:tc>
@@ -18120,7 +18124,7 @@
               <w:rPr>
                 <w:sz w:val="16"/>
               </w:rPr>
-              <w:t>2027-09-30</w:t>
+              <w:t>2028-09-01</w:t>
             </w:r>
           </w:p>
         </w:tc>
@@ -18135,7 +18139,7 @@
               <w:rPr>
                 <w:sz w:val="16"/>
               </w:rPr>
-              <w:t>TP-R1</w:t>
+              <w:t>TP-M1</w:t>
             </w:r>
           </w:p>
         </w:tc>
@@ -18148,7 +18152,7 @@
               <w:rPr>
                 <w:sz w:val="16"/>
               </w:rPr>
-              <w:t>Road access</w:t>
+              <w:t>Temporary barge landing</w:t>
             </w:r>
           </w:p>
         </w:tc>
@@ -18161,7 +18165,7 @@
               <w:rPr>
                 <w:sz w:val="16"/>
               </w:rPr>
-              <w:t>North gate</w:t>
+              <w:t>Public coastal strip south of the plot</w:t>
             </w:r>
           </w:p>
         </w:tc>
@@ -18186,6 +18190,7 @@
               <w:rPr>
                 <w:sz w:val="16"/>
               </w:rPr>
+              <w:t>Heaviest pieces: GT generator stator 340 t, GT GSU 268 t (transport weights, IEC data).</w:t>
             </w:r>
           </w:p>
         </w:tc>
@@ -18198,7 +18203,7 @@
               <w:rPr>
                 <w:sz w:val="16"/>
               </w:rPr>
-              <w:t>Existing 6 m asphalt road to the state road</w:t>
+              <w:t>Coastal permit: application by 2027-04-30 if the Contractor's permit design is received by 2027-03-31; permit targeted by 2027-09-30</w:t>
             </w:r>
           </w:p>
         </w:tc>
@@ -18211,7 +18216,7 @@
               <w:rPr>
                 <w:sz w:val="16"/>
               </w:rPr>
-              <w:t>Site roads and gate</w:t>
+              <w:t>Design, construction, operation and removal of the landing; marine works only 1 October - 30 April</w:t>
             </w:r>
           </w:p>
         </w:tc>
@@ -18224,7 +18229,7 @@
               <w:rPr>
                 <w:sz w:val="16"/>
               </w:rPr>
-              <w:t>2026-11-02</w:t>
+              <w:t>2027-09-30</w:t>
             </w:r>
           </w:p>
         </w:tc>
@@ -18239,7 +18244,7 @@
               <w:rPr>
                 <w:sz w:val="16"/>
               </w:rPr>
-              <w:t>TP-S1</w:t>
+              <w:t>TP-R1</w:t>
             </w:r>
           </w:p>
         </w:tc>
@@ -18252,7 +18257,7 @@
               <w:rPr>
                 <w:sz w:val="16"/>
               </w:rPr>
-              <w:t>Sanitary wastewater</w:t>
+              <w:t>Road access</w:t>
             </w:r>
           </w:p>
         </w:tc>
@@ -18265,7 +18270,7 @@
               <w:rPr>
                 <w:sz w:val="16"/>
               </w:rPr>
-              <w:t>None - no municipal sewer available</w:t>
+              <w:t>North gate</w:t>
             </w:r>
           </w:p>
         </w:tc>
@@ -18290,6 +18295,7 @@
               <w:rPr>
                 <w:sz w:val="16"/>
               </w:rPr>
+              <w:t>6 m asphalt, state road bridges limited to 120 t gross vehicle weight; components above about 90 t via the barge landing TP-M1 (ALP-OWN-GEN-001 section 3).</w:t>
             </w:r>
           </w:p>
         </w:tc>
@@ -18302,7 +18308,7 @@
               <w:rPr>
                 <w:sz w:val="16"/>
               </w:rPr>
-              <w:t>Nothing (no sewer)</w:t>
+              <w:t>Existing 6 m asphalt road to the state road</w:t>
             </w:r>
           </w:p>
         </w:tc>
@@ -18315,7 +18321,7 @@
               <w:rPr>
                 <w:sz w:val="16"/>
               </w:rPr>
-              <w:t>Packaged sanitary treatment plant (SC-057); treated effluent to the outfall</w:t>
+              <w:t>Site roads and gate</w:t>
             </w:r>
           </w:p>
         </w:tc>
@@ -18328,7 +18334,7 @@
               <w:rPr>
                 <w:sz w:val="16"/>
               </w:rPr>
-              <w:t>-</w:t>
+              <w:t>2026-11-02</w:t>
             </w:r>
           </w:p>
         </w:tc>
@@ -18343,7 +18349,7 @@
               <w:rPr>
                 <w:sz w:val="16"/>
               </w:rPr>
-              <w:t>TP-T1</w:t>
+              <w:t>TP-S1</w:t>
             </w:r>
           </w:p>
         </w:tc>
@@ -18356,7 +18362,7 @@
               <w:rPr>
                 <w:sz w:val="16"/>
               </w:rPr>
-              <w:t>Telecommunication</w:t>
+              <w:t>Sanitary wastewater</w:t>
             </w:r>
           </w:p>
         </w:tc>
@@ -18369,7 +18375,7 @@
               <w:rPr>
                 <w:sz w:val="16"/>
               </w:rPr>
-              <w:t>North gate</w:t>
+              <w:t>None - no municipal sewer available</w:t>
             </w:r>
           </w:p>
         </w:tc>
@@ -18406,7 +18412,7 @@
               <w:rPr>
                 <w:sz w:val="16"/>
               </w:rPr>
-              <w:t>Fibre ducts of two operators to the plot boundary</w:t>
+              <w:t>Nothing (no sewer)</w:t>
             </w:r>
           </w:p>
         </w:tc>
@@ -18419,7 +18425,7 @@
               <w:rPr>
                 <w:sz w:val="16"/>
               </w:rPr>
-              <w:t>Site telecom network and SCADA links</w:t>
+              <w:t>Packaged sanitary treatment plant (SC-057); treated effluent to the outfall</w:t>
             </w:r>
           </w:p>
         </w:tc>
@@ -18432,7 +18438,7 @@
               <w:rPr>
                 <w:sz w:val="16"/>
               </w:rPr>
-              <w:t>2027-06-30</w:t>
+              <w:t>-</w:t>
             </w:r>
           </w:p>
         </w:tc>
@@ -18447,6 +18453,318 @@
               <w:rPr>
                 <w:sz w:val="16"/>
               </w:rPr>
+              <w:t>TP-T1</w:t>
+            </w:r>
+          </w:p>
+        </w:tc>
+        <w:tc>
+          <w:tcPr>
+            <w:tcW w:type="dxa" w:w="1701"/>
+          </w:tcPr>
+          <w:p>
+            <w:r>
+              <w:rPr>
+                <w:sz w:val="16"/>
+              </w:rPr>
+              <w:t>Telecommunication</w:t>
+            </w:r>
+          </w:p>
+        </w:tc>
+        <w:tc>
+          <w:tcPr>
+            <w:tcW w:type="dxa" w:w="2154"/>
+          </w:tcPr>
+          <w:p>
+            <w:r>
+              <w:rPr>
+                <w:sz w:val="16"/>
+              </w:rPr>
+              <w:t>North gate</w:t>
+            </w:r>
+          </w:p>
+        </w:tc>
+        <w:tc>
+          <w:tcPr>
+            <w:tcW w:type="dxa" w:w="1361"/>
+          </w:tcPr>
+          <w:p>
+            <w:r>
+              <w:rPr>
+                <w:sz w:val="16"/>
+              </w:rPr>
+            </w:r>
+          </w:p>
+        </w:tc>
+        <w:tc>
+          <w:tcPr>
+            <w:tcW w:type="dxa" w:w="2268"/>
+          </w:tcPr>
+          <w:p>
+            <w:r>
+              <w:rPr>
+                <w:sz w:val="16"/>
+              </w:rPr>
+            </w:r>
+          </w:p>
+        </w:tc>
+        <w:tc>
+          <w:tcPr>
+            <w:tcW w:type="dxa" w:w="2835"/>
+          </w:tcPr>
+          <w:p>
+            <w:r>
+              <w:rPr>
+                <w:sz w:val="16"/>
+              </w:rPr>
+              <w:t>Fibre ducts of two operators to the plot boundary</w:t>
+            </w:r>
+          </w:p>
+        </w:tc>
+        <w:tc>
+          <w:tcPr>
+            <w:tcW w:type="dxa" w:w="2608"/>
+          </w:tcPr>
+          <w:p>
+            <w:r>
+              <w:rPr>
+                <w:sz w:val="16"/>
+              </w:rPr>
+              <w:t>Site telecom network and SCADA links</w:t>
+            </w:r>
+          </w:p>
+        </w:tc>
+        <w:tc>
+          <w:tcPr>
+            <w:tcW w:type="dxa" w:w="1134"/>
+          </w:tcPr>
+          <w:p>
+            <w:r>
+              <w:rPr>
+                <w:sz w:val="16"/>
+              </w:rPr>
+              <w:t>2027-06-30</w:t>
+            </w:r>
+          </w:p>
+        </w:tc>
+      </w:tr>
+      <w:tr>
+        <w:tc>
+          <w:tcPr>
+            <w:tcW w:type="dxa" w:w="850"/>
+          </w:tcPr>
+          <w:p>
+            <w:r>
+              <w:rPr>
+                <w:sz w:val="16"/>
+              </w:rPr>
+              <w:t>TP-T2</w:t>
+            </w:r>
+          </w:p>
+        </w:tc>
+        <w:tc>
+          <w:tcPr>
+            <w:tcW w:type="dxa" w:w="1701"/>
+          </w:tcPr>
+          <w:p>
+            <w:r>
+              <w:rPr>
+                <w:sz w:val="16"/>
+              </w:rPr>
+              <w:t>Emission data link to the environmental authority</w:t>
+            </w:r>
+          </w:p>
+        </w:tc>
+        <w:tc>
+          <w:tcPr>
+            <w:tcW w:type="dxa" w:w="2154"/>
+          </w:tcPr>
+          <w:p>
+            <w:r>
+              <w:rPr>
+                <w:sz w:val="16"/>
+              </w:rPr>
+              <w:t>CEMS data logger in the control building</w:t>
+            </w:r>
+          </w:p>
+        </w:tc>
+        <w:tc>
+          <w:tcPr>
+            <w:tcW w:type="dxa" w:w="1361"/>
+          </w:tcPr>
+          <w:p>
+            <w:r>
+              <w:rPr>
+                <w:sz w:val="16"/>
+              </w:rPr>
+            </w:r>
+          </w:p>
+        </w:tc>
+        <w:tc>
+          <w:tcPr>
+            <w:tcW w:type="dxa" w:w="2268"/>
+          </w:tcPr>
+          <w:p>
+            <w:r>
+              <w:rPr>
+                <w:sz w:val="16"/>
+              </w:rPr>
+            </w:r>
+          </w:p>
+        </w:tc>
+        <w:tc>
+          <w:tcPr>
+            <w:tcW w:type="dxa" w:w="2835"/>
+          </w:tcPr>
+          <w:p>
+            <w:r>
+              <w:rPr>
+                <w:sz w:val="16"/>
+              </w:rPr>
+              <w:t>Registration of the plant with the Ministry's continuous emission monitoring centre, credentials, connection agreement</w:t>
+            </w:r>
+          </w:p>
+        </w:tc>
+        <w:tc>
+          <w:tcPr>
+            <w:tcW w:type="dxa" w:w="2608"/>
+          </w:tcPr>
+          <w:p>
+            <w:r>
+              <w:rPr>
+                <w:sz w:val="16"/>
+              </w:rPr>
+              <w:t>CEMS, data acquisition and the data link (SC-038) up to the Ministry server interface</w:t>
+            </w:r>
+          </w:p>
+        </w:tc>
+        <w:tc>
+          <w:tcPr>
+            <w:tcW w:type="dxa" w:w="1134"/>
+          </w:tcPr>
+          <w:p>
+            <w:r>
+              <w:rPr>
+                <w:sz w:val="16"/>
+              </w:rPr>
+              <w:t>2028-08-01</w:t>
+            </w:r>
+          </w:p>
+        </w:tc>
+      </w:tr>
+      <w:tr>
+        <w:tc>
+          <w:tcPr>
+            <w:tcW w:type="dxa" w:w="850"/>
+          </w:tcPr>
+          <w:p>
+            <w:r>
+              <w:rPr>
+                <w:sz w:val="16"/>
+              </w:rPr>
+              <w:t>TP-T3</w:t>
+            </w:r>
+          </w:p>
+        </w:tc>
+        <w:tc>
+          <w:tcPr>
+            <w:tcW w:type="dxa" w:w="1701"/>
+          </w:tcPr>
+          <w:p>
+            <w:r>
+              <w:rPr>
+                <w:sz w:val="16"/>
+              </w:rPr>
+              <w:t>TSO SCADA and revenue metering link</w:t>
+            </w:r>
+          </w:p>
+        </w:tc>
+        <w:tc>
+          <w:tcPr>
+            <w:tcW w:type="dxa" w:w="2154"/>
+          </w:tcPr>
+          <w:p>
+            <w:r>
+              <w:rPr>
+                <w:sz w:val="16"/>
+              </w:rPr>
+              <w:t>TSO RTU and metering cubicle in the control building</w:t>
+            </w:r>
+          </w:p>
+        </w:tc>
+        <w:tc>
+          <w:tcPr>
+            <w:tcW w:type="dxa" w:w="1361"/>
+          </w:tcPr>
+          <w:p>
+            <w:r>
+              <w:rPr>
+                <w:sz w:val="16"/>
+              </w:rPr>
+            </w:r>
+          </w:p>
+        </w:tc>
+        <w:tc>
+          <w:tcPr>
+            <w:tcW w:type="dxa" w:w="2268"/>
+          </w:tcPr>
+          <w:p>
+            <w:r>
+              <w:rPr>
+                <w:sz w:val="16"/>
+              </w:rPr>
+            </w:r>
+          </w:p>
+        </w:tc>
+        <w:tc>
+          <w:tcPr>
+            <w:tcW w:type="dxa" w:w="2835"/>
+          </w:tcPr>
+          <w:p>
+            <w:r>
+              <w:rPr>
+                <w:sz w:val="16"/>
+              </w:rPr>
+              <w:t>TSO signal list and protocol, TSO end of the link, OPGW on the Owner's line</w:t>
+            </w:r>
+          </w:p>
+        </w:tc>
+        <w:tc>
+          <w:tcPr>
+            <w:tcW w:type="dxa" w:w="2608"/>
+          </w:tcPr>
+          <w:p>
+            <w:r>
+              <w:rPr>
+                <w:sz w:val="16"/>
+              </w:rPr>
+              <w:t>RTU, revenue meters, fibre from the gantry joint box, telecom equipment (SC-035)</w:t>
+            </w:r>
+          </w:p>
+        </w:tc>
+        <w:tc>
+          <w:tcPr>
+            <w:tcW w:type="dxa" w:w="1134"/>
+          </w:tcPr>
+          <w:p>
+            <w:r>
+              <w:rPr>
+                <w:sz w:val="16"/>
+              </w:rPr>
+              <w:t>2028-05-01</w:t>
+            </w:r>
+          </w:p>
+        </w:tc>
+      </w:tr>
+      <w:tr>
+        <w:tc>
+          <w:tcPr>
+            <w:tcW w:type="dxa" w:w="850"/>
+          </w:tcPr>
+          <w:p>
+            <w:r>
+              <w:rPr>
+                <w:sz w:val="16"/>
+              </w:rPr>
               <w:t>TP-W1</w:t>
             </w:r>
           </w:p>
@@ -18499,7 +18817,7 @@
               <w:rPr>
                 <w:sz w:val="16"/>
               </w:rPr>
-              <w:t>3 barg, 20 m3/h</w:t>
+              <w:t>2.5-6.0 barg at the meter outlet, 20 m3/h (municipal supply), potable quality per the Turkish drinking water regulation.</w:t>
             </w:r>
           </w:p>
         </w:tc>
@@ -31059,7 +31377,7 @@
               <w:rPr>
                 <w:sz w:val="16"/>
               </w:rPr>
-              <w:t>(open)</w:t>
+              <w:t>The export limiter shall be set to 640 MW net at the 380 kV revenue meters. The Owner has applied to the TSO for a connection capacity of 680 MW; if granted, the Owner will instruct the new set point as a variation.</w:t>
             </w:r>
           </w:p>
         </w:tc>
@@ -31072,25 +31390,25 @@
               <w:rPr>
                 <w:sz w:val="16"/>
               </w:rPr>
+              <w:t>contractor proposal accepted</w:t>
+            </w:r>
+          </w:p>
+        </w:tc>
+        <w:tc>
+          <w:tcPr>
+            <w:tcW w:type="dxa" w:w="1134"/>
+          </w:tcPr>
+          <w:p>
+            <w:r>
+              <w:rPr>
+                <w:sz w:val="16"/>
+              </w:rPr>
               <w:t>-</w:t>
             </w:r>
           </w:p>
         </w:tc>
         <w:tc>
           <w:tcPr>
-            <w:tcW w:type="dxa" w:w="1134"/>
-          </w:tcPr>
-          <w:p>
-            <w:r>
-              <w:rPr>
-                <w:sz w:val="16"/>
-              </w:rPr>
-              <w:t>-</w:t>
-            </w:r>
-          </w:p>
-        </w:tc>
-        <w:tc>
-          <w:tcPr>
             <w:tcW w:type="dxa" w:w="1757"/>
           </w:tcPr>
           <w:p>
@@ -31098,6 +31416,7 @@
               <w:rPr>
                 <w:sz w:val="16"/>
               </w:rPr>
+              <w:t>tie_in/TP-E1</w:t>
             </w:r>
           </w:p>
         </w:tc>
@@ -31283,6 +31602,323 @@
                 <w:sz w:val="16"/>
               </w:rPr>
               <w:t>-</w:t>
+            </w:r>
+          </w:p>
+        </w:tc>
+        <w:tc>
+          <w:tcPr>
+            <w:tcW w:type="dxa" w:w="1134"/>
+          </w:tcPr>
+          <w:p>
+            <w:r>
+              <w:rPr>
+                <w:sz w:val="16"/>
+              </w:rPr>
+              <w:t>-</w:t>
+            </w:r>
+          </w:p>
+        </w:tc>
+        <w:tc>
+          <w:tcPr>
+            <w:tcW w:type="dxa" w:w="1757"/>
+          </w:tcPr>
+          <w:p>
+            <w:r>
+              <w:rPr>
+                <w:sz w:val="16"/>
+              </w:rPr>
+            </w:r>
+          </w:p>
+        </w:tc>
+      </w:tr>
+      <w:tr>
+        <w:tc>
+          <w:tcPr>
+            <w:tcW w:type="dxa" w:w="794"/>
+          </w:tcPr>
+          <w:p>
+            <w:r>
+              <w:rPr>
+                <w:sz w:val="16"/>
+              </w:rPr>
+              <w:t>TQ-030</w:t>
+            </w:r>
+          </w:p>
+        </w:tc>
+        <w:tc>
+          <w:tcPr>
+            <w:tcW w:type="dxa" w:w="624"/>
+          </w:tcPr>
+          <w:p>
+            <w:r>
+              <w:rPr>
+                <w:sz w:val="16"/>
+              </w:rPr>
+              <w:t>5</w:t>
+            </w:r>
+          </w:p>
+        </w:tc>
+        <w:tc>
+          <w:tcPr>
+            <w:tcW w:type="dxa" w:w="1701"/>
+          </w:tcPr>
+          <w:p>
+            <w:r>
+              <w:rPr>
+                <w:sz w:val="16"/>
+              </w:rPr>
+              <w:t>Tie-in register: confirmation of the terminal point conditions</w:t>
+            </w:r>
+          </w:p>
+        </w:tc>
+        <w:tc>
+          <w:tcPr>
+            <w:tcW w:type="dxa" w:w="3855"/>
+          </w:tcPr>
+          <w:p>
+            <w:r>
+              <w:rPr>
+                <w:sz w:val="16"/>
+              </w:rPr>
+              <w:t>The Consortium's tie-in register (draft) states for each terminal point the exact scope break, connection, isolation, protection, operating envelope, capacity and the dates needed from the Contractor's commissioning sequence. Please confirm, and provide the missing data: (a) TP-W1 maximum supply pressure; (b) TP-E2 prospective short-circuit current of the 34.5 kV supply; (c) SC-001 (site boundary) has no terminal point - propose TP-A2 plot handover incl. the 11 kV cable relocation by 2027-06-30; (d) SC-035 and SC-038 need Owner/TSO/authority input - propose TP-T3 (TSO SCADA and metering link) and TP-T2 (emission data link to the Ministry); (e) TP-A1 is available on 2027-03-01, the day it is needed (no float): earlier access requested.</w:t>
+            </w:r>
+          </w:p>
+        </w:tc>
+        <w:tc>
+          <w:tcPr>
+            <w:tcW w:type="dxa" w:w="3628"/>
+          </w:tcPr>
+          <w:p>
+            <w:r>
+              <w:rPr>
+                <w:sz w:val="16"/>
+              </w:rPr>
+              <w:t>Register confirmed with: (a) TP-W1 2.5-6.0 barg; (b) TP-E2 12.5 kA; (c) TP-A2 added (plot, 11 kV cable relocated by 2027-06-30, east strip E 370-400 until then not available); (d) TP-T2 and TP-T3 added; (e) TP-A1 lease from 2027-02-01. The conditions of all terminal points TP-A1..TP-W1 are agreed.</w:t>
+            </w:r>
+          </w:p>
+        </w:tc>
+        <w:tc>
+          <w:tcPr>
+            <w:tcW w:type="dxa" w:w="1134"/>
+          </w:tcPr>
+          <w:p>
+            <w:r>
+              <w:rPr>
+                <w:sz w:val="16"/>
+              </w:rPr>
+              <w:t>contractor proposal accepted</w:t>
+            </w:r>
+          </w:p>
+        </w:tc>
+        <w:tc>
+          <w:tcPr>
+            <w:tcW w:type="dxa" w:w="1134"/>
+          </w:tcPr>
+          <w:p>
+            <w:r>
+              <w:rPr>
+                <w:sz w:val="16"/>
+              </w:rPr>
+              <w:t>-</w:t>
+            </w:r>
+          </w:p>
+        </w:tc>
+        <w:tc>
+          <w:tcPr>
+            <w:tcW w:type="dxa" w:w="1757"/>
+          </w:tcPr>
+          <w:p>
+            <w:r>
+              <w:rPr>
+                <w:sz w:val="16"/>
+              </w:rPr>
+              <w:t>tie_in/TP-A1, tie_in/TP-A2, tie_in/TP-CW1, tie_in/TP-CW2, tie_in/TP-D1, tie_in/TP-E1, tie_in/TP-E2, tie_in/TP-G1, tie_in/TP-L1, tie_in/TP-M1, tie_in/TP-R1, tie_in/TP-S1, tie_in/TP-T1, tie_in/TP-T2, tie_in/TP-T3, tie_in/TP-W1</w:t>
+            </w:r>
+          </w:p>
+        </w:tc>
+      </w:tr>
+      <w:tr>
+        <w:tc>
+          <w:tcPr>
+            <w:tcW w:type="dxa" w:w="794"/>
+          </w:tcPr>
+          <w:p>
+            <w:r>
+              <w:rPr>
+                <w:sz w:val="16"/>
+              </w:rPr>
+              <w:t>TQ-031</w:t>
+            </w:r>
+          </w:p>
+        </w:tc>
+        <w:tc>
+          <w:tcPr>
+            <w:tcW w:type="dxa" w:w="624"/>
+          </w:tcPr>
+          <w:p>
+            <w:r>
+              <w:rPr>
+                <w:sz w:val="16"/>
+              </w:rPr>
+              <w:t>5</w:t>
+            </w:r>
+          </w:p>
+        </w:tc>
+        <w:tc>
+          <w:tcPr>
+            <w:tcW w:type="dxa" w:w="1701"/>
+          </w:tcPr>
+          <w:p>
+            <w:r>
+              <w:rPr>
+                <w:sz w:val="16"/>
+              </w:rPr>
+              <w:t>Short-circuit level at TP-E1: plant contribution</w:t>
+            </w:r>
+          </w:p>
+        </w:tc>
+        <w:tc>
+          <w:tcPr>
+            <w:tcW w:type="dxa" w:w="3855"/>
+          </w:tcPr>
+          <w:p>
+            <w:r>
+              <w:rPr>
+                <w:sz w:val="16"/>
+              </w:rPr>
+              <w:t>ALP-OWN-ELE-001 gives 40 kA (2029) and 50 kA (2035 planning) at the plant 380 kV busbar; the GIS is specified for 50 kA (ER-11.01). The Alpilla generators add about 3.7 kA (GT 2.4 kA, ST 1.3 kA). Please confirm whether the TSO values include the Alpilla contribution; if not, 50 kA would be exceeded in 2035.</w:t>
+            </w:r>
+          </w:p>
+        </w:tc>
+        <w:tc>
+          <w:tcPr>
+            <w:tcW w:type="dxa" w:w="3628"/>
+          </w:tcPr>
+          <w:p>
+            <w:r>
+              <w:rPr>
+                <w:sz w:val="16"/>
+              </w:rPr>
+              <w:t>The TSO confirms (letter of 2026-09-25) that 40 kA (2029) and 50 kA (2035) include the contribution of the Alpilla units. The GIS rating of 50 kA stands.</w:t>
+            </w:r>
+          </w:p>
+        </w:tc>
+        <w:tc>
+          <w:tcPr>
+            <w:tcW w:type="dxa" w:w="1134"/>
+          </w:tcPr>
+          <w:p>
+            <w:r>
+              <w:rPr>
+                <w:sz w:val="16"/>
+              </w:rPr>
+              <w:t>confirmed as is</w:t>
+            </w:r>
+          </w:p>
+        </w:tc>
+        <w:tc>
+          <w:tcPr>
+            <w:tcW w:type="dxa" w:w="1134"/>
+          </w:tcPr>
+          <w:p>
+            <w:r>
+              <w:rPr>
+                <w:sz w:val="16"/>
+              </w:rPr>
+              <w:t>-</w:t>
+            </w:r>
+          </w:p>
+        </w:tc>
+        <w:tc>
+          <w:tcPr>
+            <w:tcW w:type="dxa" w:w="1757"/>
+          </w:tcPr>
+          <w:p>
+            <w:r>
+              <w:rPr>
+                <w:sz w:val="16"/>
+              </w:rPr>
+              <w:t>tie_in/TP-E1</w:t>
+            </w:r>
+          </w:p>
+        </w:tc>
+      </w:tr>
+      <w:tr>
+        <w:tc>
+          <w:tcPr>
+            <w:tcW w:type="dxa" w:w="794"/>
+          </w:tcPr>
+          <w:p>
+            <w:r>
+              <w:rPr>
+                <w:sz w:val="16"/>
+              </w:rPr>
+              <w:t>TQ-032</w:t>
+            </w:r>
+          </w:p>
+        </w:tc>
+        <w:tc>
+          <w:tcPr>
+            <w:tcW w:type="dxa" w:w="624"/>
+          </w:tcPr>
+          <w:p>
+            <w:r>
+              <w:rPr>
+                <w:sz w:val="16"/>
+              </w:rPr>
+              <w:t>5</w:t>
+            </w:r>
+          </w:p>
+        </w:tc>
+        <w:tc>
+          <w:tcPr>
+            <w:tcW w:type="dxa" w:w="1701"/>
+          </w:tcPr>
+          <w:p>
+            <w:r>
+              <w:rPr>
+                <w:sz w:val="16"/>
+              </w:rPr>
+              <w:t>Reactive capability: generator terminals (ER-04.08) or connection point (ELE-001)</w:t>
+            </w:r>
+          </w:p>
+        </w:tc>
+        <w:tc>
+          <w:tcPr>
+            <w:tcW w:type="dxa" w:w="3855"/>
+          </w:tcPr>
+          <w:p>
+            <w:r>
+              <w:rPr>
+                <w:sz w:val="16"/>
+              </w:rPr>
+              <w:t>ER-04.08 requires 0.85 lagging / 0.95 leading at rated active power at the generator terminals; ALP-OWN-ELE-001 section 3 states the same at the connection point. At the connection point, at the winter GT output of 470 MW, the GT generator and GSU would need about 600 MVA instead of 560 MVA (GSU reactive losses). Please confirm that ER-04.08 governs.</w:t>
+            </w:r>
+          </w:p>
+        </w:tc>
+        <w:tc>
+          <w:tcPr>
+            <w:tcW w:type="dxa" w:w="3628"/>
+          </w:tcPr>
+          <w:p>
+            <w:r>
+              <w:rPr>
+                <w:sz w:val="16"/>
+              </w:rPr>
+              <w:t>ER-04.08 governs: 0.85 lagging / 0.95 leading at rated active power at the generator terminals. The TSO accepts the Grid Code compliance demonstration on that basis; ALP-OWN-ELE-001 will be corrected in its next revision.</w:t>
+            </w:r>
+          </w:p>
+        </w:tc>
+        <w:tc>
+          <w:tcPr>
+            <w:tcW w:type="dxa" w:w="1134"/>
+          </w:tcPr>
+          <w:p>
+            <w:r>
+              <w:rPr>
+                <w:sz w:val="16"/>
+              </w:rPr>
+              <w:t>confirmed as is</w:t>
             </w:r>
           </w:p>
         </w:tc>
@@ -31335,7 +31971,7 @@
         <w:color w:val="595959"/>
         <w:sz w:val="16"/>
       </w:rPr>
-      <w:t xml:space="preserve">contract_document v1.2.0 | data 499b6662c7467600 | generated 2026-09-28 by SETUP | page </w:t>
+      <w:t xml:space="preserve">contract_document v1.2.0 | data 2b0cd27d5ea51094 | generated 2026-09-28 by SETUP | page </w:t>
     </w:r>
     <w:r>
       <w:rPr>

</xml_diff>

<commit_message>
Codes, standards and permits register (Appendix A.19) agreed with the Owner and IEC
- reference schema extended (kind, precedence, responsible, authority, requirements,
  deviation, agreement); new permit entity; 14 authority parties
- 100 register entries (Turkish laws/regulations, Grid Code, codes and standards) and
  24 permits with applicant, deliverables, lead time and need dates
- standards_register engine (xlsx + docx + pdf): ER citation coverage, authorities,
  agreement, permit timing; tests
- TQ-033 (Owner) and TQ-IEC-022 (IEC) closed: register adopted as Appendix A.19,
  IEC deviations recorded, earlier permit applications
- TP-CW1/CW2 need date moved to the EIA marine-works window; lesson L-EPCE-0002

Co-Authored-By: Claude Opus 5.5 <noreply@anthropic.com>
Claude-Session: https://claude.ai/code/session_01TuQPCZMPzEzscTVqEEHFMo
</commit_message>
<xml_diff>
--- a/output/contract_document/ALP-EPC-001_contract.docx
+++ b/output/contract_document/ALP-EPC-001_contract.docx
@@ -26799,7 +26799,7 @@
               <w:rPr>
                 <w:sz w:val="16"/>
               </w:rPr>
-              <w:t>IEC</w:t>
+              <w:t>DISCO</w:t>
             </w:r>
           </w:p>
         </w:tc>
@@ -26812,7 +26812,7 @@
               <w:rPr>
                 <w:sz w:val="16"/>
               </w:rPr>
-              <w:t>Imaginary Electric Company</w:t>
+              <w:t>Regional electricity distribution company (construction power)</w:t>
             </w:r>
           </w:p>
         </w:tc>
@@ -26825,7 +26825,7 @@
               <w:rPr>
                 <w:sz w:val="16"/>
               </w:rPr>
-              <w:t>consortium member</w:t>
+              <w:t>authority</w:t>
             </w:r>
           </w:p>
         </w:tc>
@@ -26838,7 +26838,7 @@
               <w:rPr>
                 <w:sz w:val="16"/>
               </w:rPr>
-              <w:t>Germany</w:t>
+              <w:t>Turkiye</w:t>
             </w:r>
           </w:p>
         </w:tc>
@@ -26851,7 +26851,6 @@
               <w:rPr>
                 <w:sz w:val="16"/>
               </w:rPr>
-              <w:t>Power Island Package Manager</w:t>
             </w:r>
           </w:p>
         </w:tc>
@@ -26864,7 +26863,6 @@
               <w:rPr>
                 <w:sz w:val="16"/>
               </w:rPr>
-              <w:t>Fictional power-equipment manufacturer</w:t>
             </w:r>
           </w:p>
         </w:tc>
@@ -26892,7 +26890,7 @@
               <w:rPr>
                 <w:sz w:val="16"/>
               </w:rPr>
-              <w:t>IEPC</w:t>
+              <w:t>DSI</w:t>
             </w:r>
           </w:p>
         </w:tc>
@@ -26905,7 +26903,7 @@
               <w:rPr>
                 <w:sz w:val="16"/>
               </w:rPr>
-              <w:t>Istanbul EPC Mühendislik ve Taahhüt A.Ş.</w:t>
+              <w:t>General Directorate of State Hydraulic Works (surface and groundwater)</w:t>
             </w:r>
           </w:p>
         </w:tc>
@@ -26918,7 +26916,7 @@
               <w:rPr>
                 <w:sz w:val="16"/>
               </w:rPr>
-              <w:t>consortium leader</w:t>
+              <w:t>authority</w:t>
             </w:r>
           </w:p>
         </w:tc>
@@ -26931,7 +26929,7 @@
               <w:rPr>
                 <w:sz w:val="16"/>
               </w:rPr>
-              <w:t>Türkiye</w:t>
+              <w:t>Turkiye</w:t>
             </w:r>
           </w:p>
         </w:tc>
@@ -26944,7 +26942,6 @@
               <w:rPr>
                 <w:sz w:val="16"/>
               </w:rPr>
-              <w:t>Consortium Project Director</w:t>
             </w:r>
           </w:p>
         </w:tc>
@@ -26957,7 +26954,6 @@
               <w:rPr>
                 <w:sz w:val="16"/>
               </w:rPr>
-              <w:t>Istanbul, Türkiye</w:t>
             </w:r>
           </w:p>
         </w:tc>
@@ -26970,7 +26966,7 @@
               <w:rPr>
                 <w:sz w:val="16"/>
               </w:rPr>
-              <w:t>yes</w:t>
+              <w:t>no</w:t>
             </w:r>
           </w:p>
         </w:tc>
@@ -26985,7 +26981,7 @@
               <w:rPr>
                 <w:sz w:val="16"/>
               </w:rPr>
-              <w:t>OE</w:t>
+              <w:t>EMRA</w:t>
             </w:r>
           </w:p>
         </w:tc>
@@ -26998,7 +26994,7 @@
               <w:rPr>
                 <w:sz w:val="16"/>
               </w:rPr>
-              <w:t>Owner's Engineer (to be appointed)</w:t>
+              <w:t>Energy Market Regulatory Authority (EPDK)</w:t>
             </w:r>
           </w:p>
         </w:tc>
@@ -27011,7 +27007,7 @@
               <w:rPr>
                 <w:sz w:val="16"/>
               </w:rPr>
-              <w:t>owners engineer</w:t>
+              <w:t>authority</w:t>
             </w:r>
           </w:p>
         </w:tc>
@@ -27024,7 +27020,7 @@
               <w:rPr>
                 <w:sz w:val="16"/>
               </w:rPr>
-              <w:t>Türkiye</w:t>
+              <w:t>Turkiye</w:t>
             </w:r>
           </w:p>
         </w:tc>
@@ -27061,7 +27057,7 @@
               <w:rPr>
                 <w:sz w:val="16"/>
               </w:rPr>
-              <w:t>yes</w:t>
+              <w:t>no</w:t>
             </w:r>
           </w:p>
         </w:tc>
@@ -27076,6 +27072,1193 @@
               <w:rPr>
                 <w:sz w:val="16"/>
               </w:rPr>
+              <w:t>GASNO</w:t>
+            </w:r>
+          </w:p>
+        </w:tc>
+        <w:tc>
+          <w:tcPr>
+            <w:tcW w:type="dxa" w:w="3402"/>
+          </w:tcPr>
+          <w:p>
+            <w:r>
+              <w:rPr>
+                <w:sz w:val="16"/>
+              </w:rPr>
+              <w:t>Natural gas transmission network operator (connection and station approval)</w:t>
+            </w:r>
+          </w:p>
+        </w:tc>
+        <w:tc>
+          <w:tcPr>
+            <w:tcW w:type="dxa" w:w="1701"/>
+          </w:tcPr>
+          <w:p>
+            <w:r>
+              <w:rPr>
+                <w:sz w:val="16"/>
+              </w:rPr>
+              <w:t>authority</w:t>
+            </w:r>
+          </w:p>
+        </w:tc>
+        <w:tc>
+          <w:tcPr>
+            <w:tcW w:type="dxa" w:w="1134"/>
+          </w:tcPr>
+          <w:p>
+            <w:r>
+              <w:rPr>
+                <w:sz w:val="16"/>
+              </w:rPr>
+              <w:t>Turkiye</w:t>
+            </w:r>
+          </w:p>
+        </w:tc>
+        <w:tc>
+          <w:tcPr>
+            <w:tcW w:type="dxa" w:w="2268"/>
+          </w:tcPr>
+          <w:p>
+            <w:r>
+              <w:rPr>
+                <w:sz w:val="16"/>
+              </w:rPr>
+            </w:r>
+          </w:p>
+        </w:tc>
+        <w:tc>
+          <w:tcPr>
+            <w:tcW w:type="dxa" w:w="3402"/>
+          </w:tcPr>
+          <w:p>
+            <w:r>
+              <w:rPr>
+                <w:sz w:val="16"/>
+              </w:rPr>
+            </w:r>
+          </w:p>
+        </w:tc>
+        <w:tc>
+          <w:tcPr>
+            <w:tcW w:type="dxa" w:w="907"/>
+          </w:tcPr>
+          <w:p>
+            <w:r>
+              <w:rPr>
+                <w:sz w:val="16"/>
+              </w:rPr>
+              <w:t>yes</w:t>
+            </w:r>
+          </w:p>
+        </w:tc>
+      </w:tr>
+      <w:tr>
+        <w:tc>
+          <w:tcPr>
+            <w:tcW w:type="dxa" w:w="907"/>
+          </w:tcPr>
+          <w:p>
+            <w:r>
+              <w:rPr>
+                <w:sz w:val="16"/>
+              </w:rPr>
+              <w:t>IEC</w:t>
+            </w:r>
+          </w:p>
+        </w:tc>
+        <w:tc>
+          <w:tcPr>
+            <w:tcW w:type="dxa" w:w="3402"/>
+          </w:tcPr>
+          <w:p>
+            <w:r>
+              <w:rPr>
+                <w:sz w:val="16"/>
+              </w:rPr>
+              <w:t>Imaginary Electric Company</w:t>
+            </w:r>
+          </w:p>
+        </w:tc>
+        <w:tc>
+          <w:tcPr>
+            <w:tcW w:type="dxa" w:w="1701"/>
+          </w:tcPr>
+          <w:p>
+            <w:r>
+              <w:rPr>
+                <w:sz w:val="16"/>
+              </w:rPr>
+              <w:t>consortium member</w:t>
+            </w:r>
+          </w:p>
+        </w:tc>
+        <w:tc>
+          <w:tcPr>
+            <w:tcW w:type="dxa" w:w="1134"/>
+          </w:tcPr>
+          <w:p>
+            <w:r>
+              <w:rPr>
+                <w:sz w:val="16"/>
+              </w:rPr>
+              <w:t>Germany</w:t>
+            </w:r>
+          </w:p>
+        </w:tc>
+        <w:tc>
+          <w:tcPr>
+            <w:tcW w:type="dxa" w:w="2268"/>
+          </w:tcPr>
+          <w:p>
+            <w:r>
+              <w:rPr>
+                <w:sz w:val="16"/>
+              </w:rPr>
+              <w:t>Power Island Package Manager</w:t>
+            </w:r>
+          </w:p>
+        </w:tc>
+        <w:tc>
+          <w:tcPr>
+            <w:tcW w:type="dxa" w:w="3402"/>
+          </w:tcPr>
+          <w:p>
+            <w:r>
+              <w:rPr>
+                <w:sz w:val="16"/>
+              </w:rPr>
+              <w:t>Fictional power-equipment manufacturer</w:t>
+            </w:r>
+          </w:p>
+        </w:tc>
+        <w:tc>
+          <w:tcPr>
+            <w:tcW w:type="dxa" w:w="907"/>
+          </w:tcPr>
+          <w:p>
+            <w:r>
+              <w:rPr>
+                <w:sz w:val="16"/>
+              </w:rPr>
+              <w:t>yes</w:t>
+            </w:r>
+          </w:p>
+        </w:tc>
+      </w:tr>
+      <w:tr>
+        <w:tc>
+          <w:tcPr>
+            <w:tcW w:type="dxa" w:w="907"/>
+          </w:tcPr>
+          <w:p>
+            <w:r>
+              <w:rPr>
+                <w:sz w:val="16"/>
+              </w:rPr>
+              <w:t>IEPC</w:t>
+            </w:r>
+          </w:p>
+        </w:tc>
+        <w:tc>
+          <w:tcPr>
+            <w:tcW w:type="dxa" w:w="3402"/>
+          </w:tcPr>
+          <w:p>
+            <w:r>
+              <w:rPr>
+                <w:sz w:val="16"/>
+              </w:rPr>
+              <w:t>Istanbul EPC Mühendislik ve Taahhüt A.Ş.</w:t>
+            </w:r>
+          </w:p>
+        </w:tc>
+        <w:tc>
+          <w:tcPr>
+            <w:tcW w:type="dxa" w:w="1701"/>
+          </w:tcPr>
+          <w:p>
+            <w:r>
+              <w:rPr>
+                <w:sz w:val="16"/>
+              </w:rPr>
+              <w:t>consortium leader</w:t>
+            </w:r>
+          </w:p>
+        </w:tc>
+        <w:tc>
+          <w:tcPr>
+            <w:tcW w:type="dxa" w:w="1134"/>
+          </w:tcPr>
+          <w:p>
+            <w:r>
+              <w:rPr>
+                <w:sz w:val="16"/>
+              </w:rPr>
+              <w:t>Türkiye</w:t>
+            </w:r>
+          </w:p>
+        </w:tc>
+        <w:tc>
+          <w:tcPr>
+            <w:tcW w:type="dxa" w:w="2268"/>
+          </w:tcPr>
+          <w:p>
+            <w:r>
+              <w:rPr>
+                <w:sz w:val="16"/>
+              </w:rPr>
+              <w:t>Consortium Project Director</w:t>
+            </w:r>
+          </w:p>
+        </w:tc>
+        <w:tc>
+          <w:tcPr>
+            <w:tcW w:type="dxa" w:w="3402"/>
+          </w:tcPr>
+          <w:p>
+            <w:r>
+              <w:rPr>
+                <w:sz w:val="16"/>
+              </w:rPr>
+              <w:t>Istanbul, Türkiye</w:t>
+            </w:r>
+          </w:p>
+        </w:tc>
+        <w:tc>
+          <w:tcPr>
+            <w:tcW w:type="dxa" w:w="907"/>
+          </w:tcPr>
+          <w:p>
+            <w:r>
+              <w:rPr>
+                <w:sz w:val="16"/>
+              </w:rPr>
+              <w:t>yes</w:t>
+            </w:r>
+          </w:p>
+        </w:tc>
+      </w:tr>
+      <w:tr>
+        <w:tc>
+          <w:tcPr>
+            <w:tcW w:type="dxa" w:w="907"/>
+          </w:tcPr>
+          <w:p>
+            <w:r>
+              <w:rPr>
+                <w:sz w:val="16"/>
+              </w:rPr>
+              <w:t>KGM</w:t>
+            </w:r>
+          </w:p>
+        </w:tc>
+        <w:tc>
+          <w:tcPr>
+            <w:tcW w:type="dxa" w:w="3402"/>
+          </w:tcPr>
+          <w:p>
+            <w:r>
+              <w:rPr>
+                <w:sz w:val="16"/>
+              </w:rPr>
+              <w:t>General Directorate of Highways (abnormal load permits)</w:t>
+            </w:r>
+          </w:p>
+        </w:tc>
+        <w:tc>
+          <w:tcPr>
+            <w:tcW w:type="dxa" w:w="1701"/>
+          </w:tcPr>
+          <w:p>
+            <w:r>
+              <w:rPr>
+                <w:sz w:val="16"/>
+              </w:rPr>
+              <w:t>authority</w:t>
+            </w:r>
+          </w:p>
+        </w:tc>
+        <w:tc>
+          <w:tcPr>
+            <w:tcW w:type="dxa" w:w="1134"/>
+          </w:tcPr>
+          <w:p>
+            <w:r>
+              <w:rPr>
+                <w:sz w:val="16"/>
+              </w:rPr>
+              <w:t>Turkiye</w:t>
+            </w:r>
+          </w:p>
+        </w:tc>
+        <w:tc>
+          <w:tcPr>
+            <w:tcW w:type="dxa" w:w="2268"/>
+          </w:tcPr>
+          <w:p>
+            <w:r>
+              <w:rPr>
+                <w:sz w:val="16"/>
+              </w:rPr>
+            </w:r>
+          </w:p>
+        </w:tc>
+        <w:tc>
+          <w:tcPr>
+            <w:tcW w:type="dxa" w:w="3402"/>
+          </w:tcPr>
+          <w:p>
+            <w:r>
+              <w:rPr>
+                <w:sz w:val="16"/>
+              </w:rPr>
+            </w:r>
+          </w:p>
+        </w:tc>
+        <w:tc>
+          <w:tcPr>
+            <w:tcW w:type="dxa" w:w="907"/>
+          </w:tcPr>
+          <w:p>
+            <w:r>
+              <w:rPr>
+                <w:sz w:val="16"/>
+              </w:rPr>
+              <w:t>no</w:t>
+            </w:r>
+          </w:p>
+        </w:tc>
+      </w:tr>
+      <w:tr>
+        <w:tc>
+          <w:tcPr>
+            <w:tcW w:type="dxa" w:w="907"/>
+          </w:tcPr>
+          <w:p>
+            <w:r>
+              <w:rPr>
+                <w:sz w:val="16"/>
+              </w:rPr>
+              <w:t>MENR</w:t>
+            </w:r>
+          </w:p>
+        </w:tc>
+        <w:tc>
+          <w:tcPr>
+            <w:tcW w:type="dxa" w:w="3402"/>
+          </w:tcPr>
+          <w:p>
+            <w:r>
+              <w:rPr>
+                <w:sz w:val="16"/>
+              </w:rPr>
+              <w:t>Ministry of Energy and Natural Resources</w:t>
+            </w:r>
+          </w:p>
+        </w:tc>
+        <w:tc>
+          <w:tcPr>
+            <w:tcW w:type="dxa" w:w="1701"/>
+          </w:tcPr>
+          <w:p>
+            <w:r>
+              <w:rPr>
+                <w:sz w:val="16"/>
+              </w:rPr>
+              <w:t>authority</w:t>
+            </w:r>
+          </w:p>
+        </w:tc>
+        <w:tc>
+          <w:tcPr>
+            <w:tcW w:type="dxa" w:w="1134"/>
+          </w:tcPr>
+          <w:p>
+            <w:r>
+              <w:rPr>
+                <w:sz w:val="16"/>
+              </w:rPr>
+              <w:t>Turkiye</w:t>
+            </w:r>
+          </w:p>
+        </w:tc>
+        <w:tc>
+          <w:tcPr>
+            <w:tcW w:type="dxa" w:w="2268"/>
+          </w:tcPr>
+          <w:p>
+            <w:r>
+              <w:rPr>
+                <w:sz w:val="16"/>
+              </w:rPr>
+            </w:r>
+          </w:p>
+        </w:tc>
+        <w:tc>
+          <w:tcPr>
+            <w:tcW w:type="dxa" w:w="3402"/>
+          </w:tcPr>
+          <w:p>
+            <w:r>
+              <w:rPr>
+                <w:sz w:val="16"/>
+              </w:rPr>
+            </w:r>
+          </w:p>
+        </w:tc>
+        <w:tc>
+          <w:tcPr>
+            <w:tcW w:type="dxa" w:w="907"/>
+          </w:tcPr>
+          <w:p>
+            <w:r>
+              <w:rPr>
+                <w:sz w:val="16"/>
+              </w:rPr>
+              <w:t>no</w:t>
+            </w:r>
+          </w:p>
+        </w:tc>
+      </w:tr>
+      <w:tr>
+        <w:tc>
+          <w:tcPr>
+            <w:tcW w:type="dxa" w:w="907"/>
+          </w:tcPr>
+          <w:p>
+            <w:r>
+              <w:rPr>
+                <w:sz w:val="16"/>
+              </w:rPr>
+              <w:t>MOCT</w:t>
+            </w:r>
+          </w:p>
+        </w:tc>
+        <w:tc>
+          <w:tcPr>
+            <w:tcW w:type="dxa" w:w="3402"/>
+          </w:tcPr>
+          <w:p>
+            <w:r>
+              <w:rPr>
+                <w:sz w:val="16"/>
+              </w:rPr>
+              <w:t>Ministry of Culture and Tourism (regional museum directorate)</w:t>
+            </w:r>
+          </w:p>
+        </w:tc>
+        <w:tc>
+          <w:tcPr>
+            <w:tcW w:type="dxa" w:w="1701"/>
+          </w:tcPr>
+          <w:p>
+            <w:r>
+              <w:rPr>
+                <w:sz w:val="16"/>
+              </w:rPr>
+              <w:t>authority</w:t>
+            </w:r>
+          </w:p>
+        </w:tc>
+        <w:tc>
+          <w:tcPr>
+            <w:tcW w:type="dxa" w:w="1134"/>
+          </w:tcPr>
+          <w:p>
+            <w:r>
+              <w:rPr>
+                <w:sz w:val="16"/>
+              </w:rPr>
+              <w:t>Turkiye</w:t>
+            </w:r>
+          </w:p>
+        </w:tc>
+        <w:tc>
+          <w:tcPr>
+            <w:tcW w:type="dxa" w:w="2268"/>
+          </w:tcPr>
+          <w:p>
+            <w:r>
+              <w:rPr>
+                <w:sz w:val="16"/>
+              </w:rPr>
+            </w:r>
+          </w:p>
+        </w:tc>
+        <w:tc>
+          <w:tcPr>
+            <w:tcW w:type="dxa" w:w="3402"/>
+          </w:tcPr>
+          <w:p>
+            <w:r>
+              <w:rPr>
+                <w:sz w:val="16"/>
+              </w:rPr>
+            </w:r>
+          </w:p>
+        </w:tc>
+        <w:tc>
+          <w:tcPr>
+            <w:tcW w:type="dxa" w:w="907"/>
+          </w:tcPr>
+          <w:p>
+            <w:r>
+              <w:rPr>
+                <w:sz w:val="16"/>
+              </w:rPr>
+              <w:t>no</w:t>
+            </w:r>
+          </w:p>
+        </w:tc>
+      </w:tr>
+      <w:tr>
+        <w:tc>
+          <w:tcPr>
+            <w:tcW w:type="dxa" w:w="907"/>
+          </w:tcPr>
+          <w:p>
+            <w:r>
+              <w:rPr>
+                <w:sz w:val="16"/>
+              </w:rPr>
+              <w:t>MOEUCC</w:t>
+            </w:r>
+          </w:p>
+        </w:tc>
+        <w:tc>
+          <w:tcPr>
+            <w:tcW w:type="dxa" w:w="3402"/>
+          </w:tcPr>
+          <w:p>
+            <w:r>
+              <w:rPr>
+                <w:sz w:val="16"/>
+              </w:rPr>
+              <w:t>Ministry of Environment, Urbanisation and Climate Change (and its Provincial Directorate)</w:t>
+            </w:r>
+          </w:p>
+        </w:tc>
+        <w:tc>
+          <w:tcPr>
+            <w:tcW w:type="dxa" w:w="1701"/>
+          </w:tcPr>
+          <w:p>
+            <w:r>
+              <w:rPr>
+                <w:sz w:val="16"/>
+              </w:rPr>
+              <w:t>authority</w:t>
+            </w:r>
+          </w:p>
+        </w:tc>
+        <w:tc>
+          <w:tcPr>
+            <w:tcW w:type="dxa" w:w="1134"/>
+          </w:tcPr>
+          <w:p>
+            <w:r>
+              <w:rPr>
+                <w:sz w:val="16"/>
+              </w:rPr>
+              <w:t>Turkiye</w:t>
+            </w:r>
+          </w:p>
+        </w:tc>
+        <w:tc>
+          <w:tcPr>
+            <w:tcW w:type="dxa" w:w="2268"/>
+          </w:tcPr>
+          <w:p>
+            <w:r>
+              <w:rPr>
+                <w:sz w:val="16"/>
+              </w:rPr>
+            </w:r>
+          </w:p>
+        </w:tc>
+        <w:tc>
+          <w:tcPr>
+            <w:tcW w:type="dxa" w:w="3402"/>
+          </w:tcPr>
+          <w:p>
+            <w:r>
+              <w:rPr>
+                <w:sz w:val="16"/>
+              </w:rPr>
+            </w:r>
+          </w:p>
+        </w:tc>
+        <w:tc>
+          <w:tcPr>
+            <w:tcW w:type="dxa" w:w="907"/>
+          </w:tcPr>
+          <w:p>
+            <w:r>
+              <w:rPr>
+                <w:sz w:val="16"/>
+              </w:rPr>
+              <w:t>no</w:t>
+            </w:r>
+          </w:p>
+        </w:tc>
+      </w:tr>
+      <w:tr>
+        <w:tc>
+          <w:tcPr>
+            <w:tcW w:type="dxa" w:w="907"/>
+          </w:tcPr>
+          <w:p>
+            <w:r>
+              <w:rPr>
+                <w:sz w:val="16"/>
+              </w:rPr>
+              <w:t>MOIT</w:t>
+            </w:r>
+          </w:p>
+        </w:tc>
+        <w:tc>
+          <w:tcPr>
+            <w:tcW w:type="dxa" w:w="3402"/>
+          </w:tcPr>
+          <w:p>
+            <w:r>
+              <w:rPr>
+                <w:sz w:val="16"/>
+              </w:rPr>
+              <w:t>Ministry of Industry and Technology (market surveillance of products)</w:t>
+            </w:r>
+          </w:p>
+        </w:tc>
+        <w:tc>
+          <w:tcPr>
+            <w:tcW w:type="dxa" w:w="1701"/>
+          </w:tcPr>
+          <w:p>
+            <w:r>
+              <w:rPr>
+                <w:sz w:val="16"/>
+              </w:rPr>
+              <w:t>authority</w:t>
+            </w:r>
+          </w:p>
+        </w:tc>
+        <w:tc>
+          <w:tcPr>
+            <w:tcW w:type="dxa" w:w="1134"/>
+          </w:tcPr>
+          <w:p>
+            <w:r>
+              <w:rPr>
+                <w:sz w:val="16"/>
+              </w:rPr>
+              <w:t>Turkiye</w:t>
+            </w:r>
+          </w:p>
+        </w:tc>
+        <w:tc>
+          <w:tcPr>
+            <w:tcW w:type="dxa" w:w="2268"/>
+          </w:tcPr>
+          <w:p>
+            <w:r>
+              <w:rPr>
+                <w:sz w:val="16"/>
+              </w:rPr>
+            </w:r>
+          </w:p>
+        </w:tc>
+        <w:tc>
+          <w:tcPr>
+            <w:tcW w:type="dxa" w:w="3402"/>
+          </w:tcPr>
+          <w:p>
+            <w:r>
+              <w:rPr>
+                <w:sz w:val="16"/>
+              </w:rPr>
+            </w:r>
+          </w:p>
+        </w:tc>
+        <w:tc>
+          <w:tcPr>
+            <w:tcW w:type="dxa" w:w="907"/>
+          </w:tcPr>
+          <w:p>
+            <w:r>
+              <w:rPr>
+                <w:sz w:val="16"/>
+              </w:rPr>
+              <w:t>no</w:t>
+            </w:r>
+          </w:p>
+        </w:tc>
+      </w:tr>
+      <w:tr>
+        <w:tc>
+          <w:tcPr>
+            <w:tcW w:type="dxa" w:w="907"/>
+          </w:tcPr>
+          <w:p>
+            <w:r>
+              <w:rPr>
+                <w:sz w:val="16"/>
+              </w:rPr>
+              <w:t>MOLSS</w:t>
+            </w:r>
+          </w:p>
+        </w:tc>
+        <w:tc>
+          <w:tcPr>
+            <w:tcW w:type="dxa" w:w="3402"/>
+          </w:tcPr>
+          <w:p>
+            <w:r>
+              <w:rPr>
+                <w:sz w:val="16"/>
+              </w:rPr>
+              <w:t>Ministry of Labour and Social Security (OHS inspection)</w:t>
+            </w:r>
+          </w:p>
+        </w:tc>
+        <w:tc>
+          <w:tcPr>
+            <w:tcW w:type="dxa" w:w="1701"/>
+          </w:tcPr>
+          <w:p>
+            <w:r>
+              <w:rPr>
+                <w:sz w:val="16"/>
+              </w:rPr>
+              <w:t>authority</w:t>
+            </w:r>
+          </w:p>
+        </w:tc>
+        <w:tc>
+          <w:tcPr>
+            <w:tcW w:type="dxa" w:w="1134"/>
+          </w:tcPr>
+          <w:p>
+            <w:r>
+              <w:rPr>
+                <w:sz w:val="16"/>
+              </w:rPr>
+              <w:t>Turkiye</w:t>
+            </w:r>
+          </w:p>
+        </w:tc>
+        <w:tc>
+          <w:tcPr>
+            <w:tcW w:type="dxa" w:w="2268"/>
+          </w:tcPr>
+          <w:p>
+            <w:r>
+              <w:rPr>
+                <w:sz w:val="16"/>
+              </w:rPr>
+            </w:r>
+          </w:p>
+        </w:tc>
+        <w:tc>
+          <w:tcPr>
+            <w:tcW w:type="dxa" w:w="3402"/>
+          </w:tcPr>
+          <w:p>
+            <w:r>
+              <w:rPr>
+                <w:sz w:val="16"/>
+              </w:rPr>
+            </w:r>
+          </w:p>
+        </w:tc>
+        <w:tc>
+          <w:tcPr>
+            <w:tcW w:type="dxa" w:w="907"/>
+          </w:tcPr>
+          <w:p>
+            <w:r>
+              <w:rPr>
+                <w:sz w:val="16"/>
+              </w:rPr>
+              <w:t>no</w:t>
+            </w:r>
+          </w:p>
+        </w:tc>
+      </w:tr>
+      <w:tr>
+        <w:tc>
+          <w:tcPr>
+            <w:tcW w:type="dxa" w:w="907"/>
+          </w:tcPr>
+          <w:p>
+            <w:r>
+              <w:rPr>
+                <w:sz w:val="16"/>
+              </w:rPr>
+              <w:t>MOTI</w:t>
+            </w:r>
+          </w:p>
+        </w:tc>
+        <w:tc>
+          <w:tcPr>
+            <w:tcW w:type="dxa" w:w="3402"/>
+          </w:tcPr>
+          <w:p>
+            <w:r>
+              <w:rPr>
+                <w:sz w:val="16"/>
+              </w:rPr>
+              <w:t>Ministry of Transport and Infrastructure (Harbour Master, coastal structures)</w:t>
+            </w:r>
+          </w:p>
+        </w:tc>
+        <w:tc>
+          <w:tcPr>
+            <w:tcW w:type="dxa" w:w="1701"/>
+          </w:tcPr>
+          <w:p>
+            <w:r>
+              <w:rPr>
+                <w:sz w:val="16"/>
+              </w:rPr>
+              <w:t>authority</w:t>
+            </w:r>
+          </w:p>
+        </w:tc>
+        <w:tc>
+          <w:tcPr>
+            <w:tcW w:type="dxa" w:w="1134"/>
+          </w:tcPr>
+          <w:p>
+            <w:r>
+              <w:rPr>
+                <w:sz w:val="16"/>
+              </w:rPr>
+              <w:t>Turkiye</w:t>
+            </w:r>
+          </w:p>
+        </w:tc>
+        <w:tc>
+          <w:tcPr>
+            <w:tcW w:type="dxa" w:w="2268"/>
+          </w:tcPr>
+          <w:p>
+            <w:r>
+              <w:rPr>
+                <w:sz w:val="16"/>
+              </w:rPr>
+            </w:r>
+          </w:p>
+        </w:tc>
+        <w:tc>
+          <w:tcPr>
+            <w:tcW w:type="dxa" w:w="3402"/>
+          </w:tcPr>
+          <w:p>
+            <w:r>
+              <w:rPr>
+                <w:sz w:val="16"/>
+              </w:rPr>
+            </w:r>
+          </w:p>
+        </w:tc>
+        <w:tc>
+          <w:tcPr>
+            <w:tcW w:type="dxa" w:w="907"/>
+          </w:tcPr>
+          <w:p>
+            <w:r>
+              <w:rPr>
+                <w:sz w:val="16"/>
+              </w:rPr>
+              <w:t>no</w:t>
+            </w:r>
+          </w:p>
+        </w:tc>
+      </w:tr>
+      <w:tr>
+        <w:tc>
+          <w:tcPr>
+            <w:tcW w:type="dxa" w:w="907"/>
+          </w:tcPr>
+          <w:p>
+            <w:r>
+              <w:rPr>
+                <w:sz w:val="16"/>
+              </w:rPr>
+              <w:t>MUNI</w:t>
+            </w:r>
+          </w:p>
+        </w:tc>
+        <w:tc>
+          <w:tcPr>
+            <w:tcW w:type="dxa" w:w="3402"/>
+          </w:tcPr>
+          <w:p>
+            <w:r>
+              <w:rPr>
+                <w:sz w:val="16"/>
+              </w:rPr>
+              <w:t>District municipality / provincial special administration (building, occupancy, fire approval, water)</w:t>
+            </w:r>
+          </w:p>
+        </w:tc>
+        <w:tc>
+          <w:tcPr>
+            <w:tcW w:type="dxa" w:w="1701"/>
+          </w:tcPr>
+          <w:p>
+            <w:r>
+              <w:rPr>
+                <w:sz w:val="16"/>
+              </w:rPr>
+              <w:t>authority</w:t>
+            </w:r>
+          </w:p>
+        </w:tc>
+        <w:tc>
+          <w:tcPr>
+            <w:tcW w:type="dxa" w:w="1134"/>
+          </w:tcPr>
+          <w:p>
+            <w:r>
+              <w:rPr>
+                <w:sz w:val="16"/>
+              </w:rPr>
+              <w:t>Turkiye</w:t>
+            </w:r>
+          </w:p>
+        </w:tc>
+        <w:tc>
+          <w:tcPr>
+            <w:tcW w:type="dxa" w:w="2268"/>
+          </w:tcPr>
+          <w:p>
+            <w:r>
+              <w:rPr>
+                <w:sz w:val="16"/>
+              </w:rPr>
+            </w:r>
+          </w:p>
+        </w:tc>
+        <w:tc>
+          <w:tcPr>
+            <w:tcW w:type="dxa" w:w="3402"/>
+          </w:tcPr>
+          <w:p>
+            <w:r>
+              <w:rPr>
+                <w:sz w:val="16"/>
+              </w:rPr>
+            </w:r>
+          </w:p>
+        </w:tc>
+        <w:tc>
+          <w:tcPr>
+            <w:tcW w:type="dxa" w:w="907"/>
+          </w:tcPr>
+          <w:p>
+            <w:r>
+              <w:rPr>
+                <w:sz w:val="16"/>
+              </w:rPr>
+              <w:t>no</w:t>
+            </w:r>
+          </w:p>
+        </w:tc>
+      </w:tr>
+      <w:tr>
+        <w:tc>
+          <w:tcPr>
+            <w:tcW w:type="dxa" w:w="907"/>
+          </w:tcPr>
+          <w:p>
+            <w:r>
+              <w:rPr>
+                <w:sz w:val="16"/>
+              </w:rPr>
+              <w:t>NDK</w:t>
+            </w:r>
+          </w:p>
+        </w:tc>
+        <w:tc>
+          <w:tcPr>
+            <w:tcW w:type="dxa" w:w="3402"/>
+          </w:tcPr>
+          <w:p>
+            <w:r>
+              <w:rPr>
+                <w:sz w:val="16"/>
+              </w:rPr>
+              <w:t>Nuclear Regulatory Authority (radiation sources for NDT)</w:t>
+            </w:r>
+          </w:p>
+        </w:tc>
+        <w:tc>
+          <w:tcPr>
+            <w:tcW w:type="dxa" w:w="1701"/>
+          </w:tcPr>
+          <w:p>
+            <w:r>
+              <w:rPr>
+                <w:sz w:val="16"/>
+              </w:rPr>
+              <w:t>authority</w:t>
+            </w:r>
+          </w:p>
+        </w:tc>
+        <w:tc>
+          <w:tcPr>
+            <w:tcW w:type="dxa" w:w="1134"/>
+          </w:tcPr>
+          <w:p>
+            <w:r>
+              <w:rPr>
+                <w:sz w:val="16"/>
+              </w:rPr>
+              <w:t>Turkiye</w:t>
+            </w:r>
+          </w:p>
+        </w:tc>
+        <w:tc>
+          <w:tcPr>
+            <w:tcW w:type="dxa" w:w="2268"/>
+          </w:tcPr>
+          <w:p>
+            <w:r>
+              <w:rPr>
+                <w:sz w:val="16"/>
+              </w:rPr>
+            </w:r>
+          </w:p>
+        </w:tc>
+        <w:tc>
+          <w:tcPr>
+            <w:tcW w:type="dxa" w:w="3402"/>
+          </w:tcPr>
+          <w:p>
+            <w:r>
+              <w:rPr>
+                <w:sz w:val="16"/>
+              </w:rPr>
+            </w:r>
+          </w:p>
+        </w:tc>
+        <w:tc>
+          <w:tcPr>
+            <w:tcW w:type="dxa" w:w="907"/>
+          </w:tcPr>
+          <w:p>
+            <w:r>
+              <w:rPr>
+                <w:sz w:val="16"/>
+              </w:rPr>
+              <w:t>no</w:t>
+            </w:r>
+          </w:p>
+        </w:tc>
+      </w:tr>
+      <w:tr>
+        <w:tc>
+          <w:tcPr>
+            <w:tcW w:type="dxa" w:w="907"/>
+          </w:tcPr>
+          <w:p>
+            <w:r>
+              <w:rPr>
+                <w:sz w:val="16"/>
+              </w:rPr>
+              <w:t>OE</w:t>
+            </w:r>
+          </w:p>
+        </w:tc>
+        <w:tc>
+          <w:tcPr>
+            <w:tcW w:type="dxa" w:w="3402"/>
+          </w:tcPr>
+          <w:p>
+            <w:r>
+              <w:rPr>
+                <w:sz w:val="16"/>
+              </w:rPr>
+              <w:t>Owner's Engineer (to be appointed)</w:t>
+            </w:r>
+          </w:p>
+        </w:tc>
+        <w:tc>
+          <w:tcPr>
+            <w:tcW w:type="dxa" w:w="1701"/>
+          </w:tcPr>
+          <w:p>
+            <w:r>
+              <w:rPr>
+                <w:sz w:val="16"/>
+              </w:rPr>
+              <w:t>owners engineer</w:t>
+            </w:r>
+          </w:p>
+        </w:tc>
+        <w:tc>
+          <w:tcPr>
+            <w:tcW w:type="dxa" w:w="1134"/>
+          </w:tcPr>
+          <w:p>
+            <w:r>
+              <w:rPr>
+                <w:sz w:val="16"/>
+              </w:rPr>
+              <w:t>Türkiye</w:t>
+            </w:r>
+          </w:p>
+        </w:tc>
+        <w:tc>
+          <w:tcPr>
+            <w:tcW w:type="dxa" w:w="2268"/>
+          </w:tcPr>
+          <w:p>
+            <w:r>
+              <w:rPr>
+                <w:sz w:val="16"/>
+              </w:rPr>
+            </w:r>
+          </w:p>
+        </w:tc>
+        <w:tc>
+          <w:tcPr>
+            <w:tcW w:type="dxa" w:w="3402"/>
+          </w:tcPr>
+          <w:p>
+            <w:r>
+              <w:rPr>
+                <w:sz w:val="16"/>
+              </w:rPr>
+            </w:r>
+          </w:p>
+        </w:tc>
+        <w:tc>
+          <w:tcPr>
+            <w:tcW w:type="dxa" w:w="907"/>
+          </w:tcPr>
+          <w:p>
+            <w:r>
+              <w:rPr>
+                <w:sz w:val="16"/>
+              </w:rPr>
+              <w:t>yes</w:t>
+            </w:r>
+          </w:p>
+        </w:tc>
+      </w:tr>
+      <w:tr>
+        <w:tc>
+          <w:tcPr>
+            <w:tcW w:type="dxa" w:w="907"/>
+          </w:tcPr>
+          <w:p>
+            <w:r>
+              <w:rPr>
+                <w:sz w:val="16"/>
+              </w:rPr>
               <w:t>OWNER</w:t>
             </w:r>
           </w:p>
@@ -27155,6 +28338,97 @@
                 <w:sz w:val="16"/>
               </w:rPr>
               <w:t>yes</w:t>
+            </w:r>
+          </w:p>
+        </w:tc>
+      </w:tr>
+      <w:tr>
+        <w:tc>
+          <w:tcPr>
+            <w:tcW w:type="dxa" w:w="907"/>
+          </w:tcPr>
+          <w:p>
+            <w:r>
+              <w:rPr>
+                <w:sz w:val="16"/>
+              </w:rPr>
+              <w:t>SGK</w:t>
+            </w:r>
+          </w:p>
+        </w:tc>
+        <w:tc>
+          <w:tcPr>
+            <w:tcW w:type="dxa" w:w="3402"/>
+          </w:tcPr>
+          <w:p>
+            <w:r>
+              <w:rPr>
+                <w:sz w:val="16"/>
+              </w:rPr>
+              <w:t>Social Security Institution (workplace registration)</w:t>
+            </w:r>
+          </w:p>
+        </w:tc>
+        <w:tc>
+          <w:tcPr>
+            <w:tcW w:type="dxa" w:w="1701"/>
+          </w:tcPr>
+          <w:p>
+            <w:r>
+              <w:rPr>
+                <w:sz w:val="16"/>
+              </w:rPr>
+              <w:t>authority</w:t>
+            </w:r>
+          </w:p>
+        </w:tc>
+        <w:tc>
+          <w:tcPr>
+            <w:tcW w:type="dxa" w:w="1134"/>
+          </w:tcPr>
+          <w:p>
+            <w:r>
+              <w:rPr>
+                <w:sz w:val="16"/>
+              </w:rPr>
+              <w:t>Turkiye</w:t>
+            </w:r>
+          </w:p>
+        </w:tc>
+        <w:tc>
+          <w:tcPr>
+            <w:tcW w:type="dxa" w:w="2268"/>
+          </w:tcPr>
+          <w:p>
+            <w:r>
+              <w:rPr>
+                <w:sz w:val="16"/>
+              </w:rPr>
+            </w:r>
+          </w:p>
+        </w:tc>
+        <w:tc>
+          <w:tcPr>
+            <w:tcW w:type="dxa" w:w="3402"/>
+          </w:tcPr>
+          <w:p>
+            <w:r>
+              <w:rPr>
+                <w:sz w:val="16"/>
+              </w:rPr>
+            </w:r>
+          </w:p>
+        </w:tc>
+        <w:tc>
+          <w:tcPr>
+            <w:tcW w:type="dxa" w:w="907"/>
+          </w:tcPr>
+          <w:p>
+            <w:r>
+              <w:rPr>
+                <w:sz w:val="16"/>
+              </w:rPr>
+              <w:t>no</w:t>
             </w:r>
           </w:p>
         </w:tc>
@@ -31948,6 +33222,112 @@
           </w:p>
         </w:tc>
       </w:tr>
+      <w:tr>
+        <w:tc>
+          <w:tcPr>
+            <w:tcW w:type="dxa" w:w="794"/>
+          </w:tcPr>
+          <w:p>
+            <w:r>
+              <w:rPr>
+                <w:sz w:val="16"/>
+              </w:rPr>
+              <w:t>TQ-033</w:t>
+            </w:r>
+          </w:p>
+        </w:tc>
+        <w:tc>
+          <w:tcPr>
+            <w:tcW w:type="dxa" w:w="624"/>
+          </w:tcPr>
+          <w:p>
+            <w:r>
+              <w:rPr>
+                <w:sz w:val="16"/>
+              </w:rPr>
+              <w:t>5</w:t>
+            </w:r>
+          </w:p>
+        </w:tc>
+        <w:tc>
+          <w:tcPr>
+            <w:tcW w:type="dxa" w:w="1701"/>
+          </w:tcPr>
+          <w:p>
+            <w:r>
+              <w:rPr>
+                <w:sz w:val="16"/>
+              </w:rPr>
+              <w:t>Appendix A.19 (codes and standards) and the permits register</w:t>
+            </w:r>
+          </w:p>
+        </w:tc>
+        <w:tc>
+          <w:tcPr>
+            <w:tcW w:type="dxa" w:w="3855"/>
+          </w:tcPr>
+          <w:p>
+            <w:r>
+              <w:rPr>
+                <w:sz w:val="16"/>
+              </w:rPr>
+              <w:t>ER-01.07 sets the order of precedence and refers to 'the codes and standards listed in Appendix A.19', but the Contract has no Appendix A.19. The Consortium proposes the attached register (Turkish laws and regulations, Grid Code, codes and standards, each with edition, responsible party and the ER it serves) as Appendix A.19, and the permits register with applicant, supporting deliverables, lead times and need dates. Please confirm: (a) the register as Appendix A.19, editions at the Base Date; (b) the EIA limits (ER-14.02) govern over the Large Combustion Plants Regulation where stricter; (c) the permit split: the Owner applies for and holds the development, permanent-works and operating permits (SC-003), the Contractor for its construction permits; (d) permits PMT-005, PMT-007, PMT-014 have less than 14 days float between approval and need - earlier applications requested; (e) dates of PMT-001 and PMT-002.</w:t>
+            </w:r>
+          </w:p>
+        </w:tc>
+        <w:tc>
+          <w:tcPr>
+            <w:tcW w:type="dxa" w:w="3628"/>
+          </w:tcPr>
+          <w:p>
+            <w:r>
+              <w:rPr>
+                <w:sz w:val="16"/>
+              </w:rPr>
+              <w:t>(a) Agreed: the register (with ISO 14001 added by the Owner) is Appendix A.19; editions at the Base Date. (b) Confirmed: the stricter EIA limits of ER-14.02 govern. (c) Confirmed. (d) The Owner applies for PMT-005 on 2026-11-16, PMT-007 on 2027-04-01 (Contractor's design by 2027-03-31) and PMT-014 on 2028-03-15; the Contractor advances its own applications likewise. (e) PMT-001 granted 2026-03-12, PMT-002 granted 2026-05-28.</w:t>
+            </w:r>
+          </w:p>
+        </w:tc>
+        <w:tc>
+          <w:tcPr>
+            <w:tcW w:type="dxa" w:w="1134"/>
+          </w:tcPr>
+          <w:p>
+            <w:r>
+              <w:rPr>
+                <w:sz w:val="16"/>
+              </w:rPr>
+              <w:t>contractor proposal accepted</w:t>
+            </w:r>
+          </w:p>
+        </w:tc>
+        <w:tc>
+          <w:tcPr>
+            <w:tcW w:type="dxa" w:w="1134"/>
+          </w:tcPr>
+          <w:p>
+            <w:r>
+              <w:rPr>
+                <w:sz w:val="16"/>
+              </w:rPr>
+              <w:t>-</w:t>
+            </w:r>
+          </w:p>
+        </w:tc>
+        <w:tc>
+          <w:tcPr>
+            <w:tcW w:type="dxa" w:w="1757"/>
+          </w:tcPr>
+          <w:p>
+            <w:r>
+              <w:rPr>
+                <w:sz w:val="16"/>
+              </w:rPr>
+              <w:t>permit/PMT-001, permit/PMT-002, permit/PMT-005, permit/PMT-007, permit/PMT-014</w:t>
+            </w:r>
+          </w:p>
+        </w:tc>
+      </w:tr>
     </w:tbl>
     <w:p/>
     <w:sectPr>
@@ -31971,7 +33351,7 @@
         <w:color w:val="595959"/>
         <w:sz w:val="16"/>
       </w:rPr>
-      <w:t xml:space="preserve">contract_document v1.2.0 | data 2b0cd27d5ea51094 | generated 2026-09-28 by SETUP | page </w:t>
+      <w:t xml:space="preserve">contract_document v1.2.0 | data af4120cfb0108468 | generated 2026-09-28 by SETUP | page </w:t>
     </w:r>
     <w:r>
       <w:rPr>

</xml_diff>

<commit_message>
IEC general arrangement drawings GA-100..104 with installation and maintenance requirements
- temporary_codes/case_iec_documents/iec_drawings.py: A1 DXF + PDF drawings (power island
  arrangement, GT and generator, ST/generator/condenser, HRSG, GSUs) with withdrawal and
  maintenance spaces, laydown, crane coverage and pads, heavy-haul SPMT access and
  requirement tables; weights from DS-101..106 / REQ-001; automatic frame/overlap checks
- sources/iec: GA-100..104 Rev 0 registered (SRC-IECE-0009..0013)
- equipment records: positions and envelopes from the GAs (EPC load)
- plot_plan 1.1.0: linetype scale and text heights follow the drawing scale (site extents
  took minutes and were unreadable)
- TP-M1: heaviest piece corrected to the GT core engine 405 t; lesson L-EPCE-0003

Co-Authored-By: Claude Opus 5.5 <noreply@anthropic.com>
Claude-Session: https://claude.ai/code/session_01TuQPCZMPzEzscTVqEEHFMo
</commit_message>
<xml_diff>
--- a/output/contract_document/ALP-EPC-001_contract.docx
+++ b/output/contract_document/ALP-EPC-001_contract.docx
@@ -18190,7 +18190,7 @@
               <w:rPr>
                 <w:sz w:val="16"/>
               </w:rPr>
-              <w:t>Heaviest pieces: GT generator stator 340 t, GT GSU 268 t (transport weights, IEC data).</w:t>
+              <w:t>Heaviest pieces (IEC-ALP-REQ-001 section 10): GT core engine 405 t (13.2 x 5.9 x 5.6 m, about 480 t gross on SPMT), GT generator stator 340 t, GT GSU 268 t; landing and haul road designed for 480 t gross SPMT loads.</w:t>
             </w:r>
           </w:p>
         </w:tc>
@@ -33351,7 +33351,7 @@
         <w:color w:val="595959"/>
         <w:sz w:val="16"/>
       </w:rPr>
-      <w:t xml:space="preserve">contract_document v1.2.0 | data af4120cfb0108468 | generated 2026-09-28 by SETUP | page </w:t>
+      <w:t xml:space="preserve">contract_document v1.2.0 | data a4834a64b95c21d8 | generated 2026-09-28 by SETUP | page </w:t>
     </w:r>
     <w:r>
       <w:rPr>

</xml_diff>